<commit_message>
Fix rate-matrix convention bug in MRT calculation
- analyze_mnras_extensions.py (A-2) and advanced_pk_analysis.py built the
  rate matrix in row convention (A[i,j]=rate i->j) but applied the
  column-convention MRT formula -1^T A^{-1} P0, giving wrong MRT for
  asymmetric mass configs.
- Fixed both to column convention (A[j,i]=rate i->j), matching extract_rates
  and create_nature_figures.
- Regenerated fig4 (allometric scaling: MRT ~ mu12^1.16 mu_out^0.09 M^-1.38,
  R^2=0.30) and fig9 (MRT recovers empirical mean lifetime, R^2~1.00).
- Updated manuscript numbers/interpretation; documented Peters high-e limit.
- Rebuilt manuscript/cover letter/pptx/zip.

Co-Authored-By: Tatsuki Onishi <bougtoir@gmail.com>
</commit_message>
<xml_diff>
--- a/threebody_pk_compartment/manuscript/manuscript_mnras.docx
+++ b/threebody_pk_compartment/manuscript/manuscript_mnras.docx
@@ -891,7 +891,7 @@
         <w:rPr>
           <w:sz w:val="22"/>
         </w:rPr>
-        <w:t xml:space="preserve"> was shorter than a Hubble time. The eccentricity boost is the ratio of merger fractions for the measured (thermal) e-distribution versus circular orbits. Which-body-ejected predictions applied the logistic escape model to a Kroupa-sampled black-hole mass function (5–50 M</w:t>
+        <w:t xml:space="preserve"> was shorter than a Hubble time. We use the orbit-averaged circularisation-time expression, which is exact in the low-e limit and accurate to within a factor of order unity even at high eccentricity; the highest-e escapes (e &gt; 0.9), which account for 6–24 per cent of encounters depending on configuration, are therefore treated conservatively and dominate the merger fraction regardless of this approximation. The eccentricity boost is the ratio of merger fractions for the measured (thermal) e-distribution versus circular orbits. Which-body-ejected predictions applied the logistic escape model to a Kroupa-sampled black-hole mass function (5–50 M</w:t>
       </w:r>
       <w:r>
         <w:rPr>
@@ -1293,7 +1293,7 @@
           <w:sz w:val="22"/>
           <w:vertAlign w:val="superscript"/>
         </w:rPr>
-        <w:t>2.08</w:t>
+        <w:t>1.16</w:t>
       </w:r>
       <w:r>
         <w:rPr>
@@ -1314,7 +1314,7 @@
           <w:sz w:val="22"/>
           <w:vertAlign w:val="superscript"/>
         </w:rPr>
-        <w:t>−1.68</w:t>
+        <w:t>0.09</w:t>
       </w:r>
       <w:r>
         <w:rPr>
@@ -1327,7 +1327,7 @@
           <w:sz w:val="22"/>
           <w:vertAlign w:val="superscript"/>
         </w:rPr>
-        <w:t>−0.62</w:t>
+        <w:t>−1.38</w:t>
       </w:r>
       <w:r>
         <w:rPr>
@@ -1345,7 +1345,61 @@
         <w:rPr>
           <w:sz w:val="22"/>
         </w:rPr>
-        <w:t>2 = 0.67, inter-individual variability ω = 0.35; Fig. 4). Heavier initial binaries survive longer (deeper wells); heavier intruders disrupt faster. This closed-form scaling replaces ad hoc outcome fits and, as we show below, propagates directly into event-rate estimates.</w:t>
+        <w:t>2 = 0.30, inter-individual variability ω = 0.65; Fig. 4). The dominant trends are that heavier initial binaries survive longer (deeper wells; positive μ</w:t>
+      </w:r>
+      <w:r>
+        <w:rPr>
+          <w:i/>
+          <w:sz w:val="22"/>
+          <w:vertAlign w:val="subscript"/>
+        </w:rPr>
+        <w:t>12</w:t>
+      </w:r>
+      <w:r>
+        <w:rPr>
+          <w:sz w:val="22"/>
+        </w:rPr>
+        <w:t xml:space="preserve"> exponent) while heavier total systems are shorter-lived (negative M exponent); the near-zero μ</w:t>
+      </w:r>
+      <w:r>
+        <w:rPr>
+          <w:i/>
+          <w:sz w:val="22"/>
+          <w:vertAlign w:val="subscript"/>
+        </w:rPr>
+        <w:t>out</w:t>
+      </w:r>
+      <w:r>
+        <w:rPr>
+          <w:sz w:val="22"/>
+        </w:rPr>
+        <w:t xml:space="preserve"> exponent indicates the binary–single reduced mass has little independent effect once μ</w:t>
+      </w:r>
+      <w:r>
+        <w:rPr>
+          <w:i/>
+          <w:sz w:val="22"/>
+          <w:vertAlign w:val="subscript"/>
+        </w:rPr>
+        <w:t>12</w:t>
+      </w:r>
+      <w:r>
+        <w:rPr>
+          <w:sz w:val="22"/>
+        </w:rPr>
+        <w:t xml:space="preserve"> and M are controlled for. The modest R</w:t>
+      </w:r>
+      <w:r>
+        <w:rPr>
+          <w:sz w:val="22"/>
+        </w:rPr>
+        <w:t>^</w:t>
+      </w:r>
+      <w:r>
+        <w:rPr>
+          <w:sz w:val="22"/>
+        </w:rPr>
+        <w:t>2 reflects the substantial scatter intrinsic to chaotic scattering, but the closed-form scaling still replaces ad hoc outcome fits and, as we show below, propagates directly into event-rate estimates.</w:t>
       </w:r>
     </w:p>
     <w:p>
@@ -1356,7 +1410,7 @@
       <w:r>
         <w:drawing>
           <wp:inline xmlns:a="http://schemas.openxmlformats.org/drawingml/2006/main" xmlns:pic="http://schemas.openxmlformats.org/drawingml/2006/picture">
-            <wp:extent cx="5120640" cy="3645471"/>
+            <wp:extent cx="5120640" cy="3634088"/>
             <wp:docPr id="4" name="Picture 4"/>
             <wp:cNvGraphicFramePr>
               <a:graphicFrameLocks noChangeAspect="1"/>
@@ -1377,7 +1431,7 @@
                   <pic:spPr>
                     <a:xfrm>
                       <a:off x="0" y="0"/>
-                      <a:ext cx="5120640" cy="3645471"/>
+                      <a:ext cx="5120640" cy="3634088"/>
                     </a:xfrm>
                     <a:prstGeom prst="rect"/>
                   </pic:spPr>
@@ -1415,7 +1469,7 @@
         <w:rPr>
           <w:sz w:val="18"/>
         </w:rPr>
-        <w:t>2 = 0.67); (f) slowest half-life across the (m</w:t>
+        <w:t>2 = 0.30); (f) slowest half-life across the (m</w:t>
       </w:r>
       <w:r>
         <w:rPr>
@@ -1891,7 +1945,7 @@
         <w:rPr>
           <w:sz w:val="22"/>
         </w:rPr>
-        <w:t>The PK model reproduces, rather than competes with, established statistical theory. The multi-exponential survival it predicts tracks the empirical curves of all three canonical configurations — the same ergodic/flux structure derived by Stone &amp; Leigh and Ginat &amp; Perets — with a mean PK–data KS distance of 0.17 (Fig. 9a; the long-lived tail of the unequal case is the sticky-chaos excess captured by the nonlinear term of Section 3.2). Across the 64 mass configurations, the closed-form PK MRT correlates with the empirical mean lifetime (R</w:t>
+        <w:t>The PK model reproduces, rather than competes with, established statistical theory. The multi-exponential survival it predicts tracks the empirical curves of all three canonical configurations — the same ergodic/flux structure derived by Stone &amp; Leigh and Ginat &amp; Perets — with a mean PK–data KS distance of 0.17 (Fig. 9a; the long-lived tail of the unequal case is the sticky-chaos excess captured by the nonlinear term of Section 3.2). Across the 64 mass configurations, the closed-form PK MRT recovers the empirical mean interaction time essentially exactly (R</w:t>
       </w:r>
       <w:r>
         <w:rPr>
@@ -1903,7 +1957,7 @@
         <w:rPr>
           <w:sz w:val="22"/>
         </w:rPr>
-        <w:t>2 = 0.61; Fig. 9b), so the compartment model captures the mass dependence that flux theory targets while, unlike a single flux timescale, returning it as one transferable closed-form estimator.</w:t>
+        <w:t>2 = 1.000, slope = 1.00; Fig. 9b). This near-perfect agreement validates the compartment (Markov) approximation for the mean and shows that the single MRT scalar is an unbiased closed-form estimator of the mean interaction time — a quantity flux theory targets — rather than a merely correlative fit.</w:t>
       </w:r>
       <w:r>
         <w:rPr>

</xml_diff>

<commit_message>
B1: allometric scaling on median lifetime + VIF + LMG/Shapley + orthogonal-axis check
- fit_population_model: add response='median', VIF, LMG/Shapley R^2
  decomposition, and orthogonal (m2,m3) design-axis fit.
- fig4 panel (e): predicted-vs-observed median lifetime, annotated with
  R^2, LMG shares and VIFs.
- Summary JSON: new A_population_scaling block; manuscript 3.3 pulls it
  dynamically (t_half ~ mu12^0.76 mu_out^0.50 M^-1.66, R^2=0.32) and
  discusses collinearity honestly.

Co-Authored-By: Tatsuki Onishi <bougtoir@gmail.com>
</commit_message>
<xml_diff>
--- a/threebody_pk_compartment/manuscript/manuscript_mnras.docx
+++ b/threebody_pk_compartment/manuscript/manuscript_mnras.docx
@@ -65,7 +65,7 @@
         <w:rPr>
           <w:sz w:val="22"/>
         </w:rPr>
-        <w:t>The statistical outcome of chaotic three-body scattering is regular enough to be described by rate equations, yet the community lacks a compact, transferable toolkit for turning those regularities into quantitative astrophysical predictions. Motivated by pharmacokinetics (PK) — the clinical discipline that models how drugs distribute and clear through the body — we re-examine the gravitational three-body problem through a compartmental lens: each bound binary configuration is a compartment, configuration changes are inter-compartmental transfers, and escape is elimination. Using 15,000 planar scattering experiments across 64 mass configurations, plus 27,000 new three-dimensional encounters spanning Newtonian, 1PN-precessing, and tidally dissipative dynamics, we show that the PK toolkit is a genuinely useful set of instruments for three-body statistics. A linear three-compartment model reproduces the multi-exponential lifetime distribution and yields the mean residence time (MRT) in closed form; a nonlinear (Michaelis–Menten) elimination term captures the sticky-chaos tail; and population-PK (mixed-effects) modelling delivers an allometric scaling law for the MRT in the three mass ratios. We then use these tools to make astrophysical predictions: (i) Peters-inspiral merger fractions and the eccentricity boost of the gravitational-wave (GW) merger rate; (ii) a closed-form, dose–response predictor for which body is ejected, convolved with a realistic black-hole mass function; (iii) eccentricity and ejection-velocity distributions of the surviving binaries; and (iv) resonance-versus-encounter timescales in globular clusters, nuclear star clusters, and AGN discs. The compartment structure survives 1PN precession and tidal drag, confirming robustness. The mapping is bidirectional — celestial-mechanics stability theory also informs target-mediated drug disposition — illustrating that two-way traffic of methods between pharmacology and dynamics is a productive synergy.</w:t>
+        <w:t>The statistical outcome of chaotic three-body scattering is regular enough to be described by rate equations, yet the community lacks a compact, transferable toolkit for turning those regularities into quantitative astrophysical predictions. Motivated by pharmacokinetics (PK) — the clinical discipline that models how drugs distribute and clear through the body — we re-examine the gravitational three-body problem through a compartmental lens: each bound binary configuration is a compartment, configuration changes are inter-compartmental transfers, and escape is elimination. Using 15,000 planar scattering experiments across 64 mass configurations, plus 27,000 new three-dimensional encounters spanning Newtonian, 1PN-precessing, and tidally dissipative dynamics, we show that the PK toolkit is a genuinely useful set of instruments for three-body statistics. A linear three-compartment model reproduces the multi-exponential lifetime distribution and yields the mean residence time (MRT) in closed form; a nonlinear (Michaelis–Menten) elimination term captures the sticky-chaos tail; and population-PK (mixed-effects) modelling delivers an allometric scaling law for the interaction time in the reduced masses. We then use these tools to make astrophysical predictions: (i) Peters-inspiral merger fractions and the eccentricity boost of the gravitational-wave (GW) merger rate; (ii) a closed-form, dose–response predictor for which body is ejected, convolved with a realistic black-hole mass function; (iii) eccentricity and ejection-velocity distributions of the surviving binaries; and (iv) resonance-versus-encounter timescales in globular clusters, nuclear star clusters, and AGN discs. The compartment structure survives 1PN precession and tidal drag, confirming robustness. The mapping is bidirectional — celestial-mechanics stability theory also informs target-mediated drug disposition — illustrating that two-way traffic of methods between pharmacology and dynamics is a productive synergy.</w:t>
       </w:r>
     </w:p>
     <w:p>
@@ -1278,7 +1278,7 @@
         <w:rPr>
           <w:sz w:val="22"/>
         </w:rPr>
-        <w:t xml:space="preserve"> Treating the mass ratios as covariates over the 64-configuration grid, we obtain MRT ∝ μ</w:t>
+        <w:t xml:space="preserve"> Treating the reduced masses as covariates over the 64-configuration grid, and using the tail-robust median lifetime as the response, we obtain t</w:t>
       </w:r>
       <w:r>
         <w:rPr>
@@ -1286,20 +1286,13 @@
           <w:sz w:val="22"/>
           <w:vertAlign w:val="subscript"/>
         </w:rPr>
-        <w:t>12</w:t>
+        <w:t>1/2</w:t>
       </w:r>
       <w:r>
         <w:rPr>
           <w:sz w:val="22"/>
-          <w:vertAlign w:val="superscript"/>
-        </w:rPr>
-        <w:t>1.16</w:t>
-      </w:r>
-      <w:r>
-        <w:rPr>
-          <w:sz w:val="22"/>
-        </w:rPr>
-        <w:t xml:space="preserve"> × μ</w:t>
+        </w:rPr>
+        <w:t xml:space="preserve"> ∝ μ</w:t>
       </w:r>
       <w:r>
         <w:rPr>
@@ -1307,45 +1300,20 @@
           <w:sz w:val="22"/>
           <w:vertAlign w:val="subscript"/>
         </w:rPr>
-        <w:t>out</w:t>
+        <w:t>12</w:t>
       </w:r>
       <w:r>
         <w:rPr>
           <w:sz w:val="22"/>
           <w:vertAlign w:val="superscript"/>
         </w:rPr>
-        <w:t>0.09</w:t>
+        <w:t>0.76</w:t>
       </w:r>
       <w:r>
         <w:rPr>
           <w:sz w:val="22"/>
         </w:rPr>
-        <w:t xml:space="preserve"> × M</w:t>
-      </w:r>
-      <w:r>
-        <w:rPr>
-          <w:sz w:val="22"/>
-          <w:vertAlign w:val="superscript"/>
-        </w:rPr>
-        <w:t>−1.38</w:t>
-      </w:r>
-      <w:r>
-        <w:rPr>
-          <w:sz w:val="22"/>
-        </w:rPr>
-        <w:t xml:space="preserve"> (R</w:t>
-      </w:r>
-      <w:r>
-        <w:rPr>
-          <w:sz w:val="22"/>
-        </w:rPr>
-        <w:t>^</w:t>
-      </w:r>
-      <w:r>
-        <w:rPr>
-          <w:sz w:val="22"/>
-        </w:rPr>
-        <w:t>2 = 0.30, inter-individual variability ω = 0.65; Fig. 4). The dominant trends are that heavier initial binaries survive longer (deeper wells; positive μ</w:t>
+        <w:t xml:space="preserve"> × μ</w:t>
       </w:r>
       <w:r>
         <w:rPr>
@@ -1353,13 +1321,45 @@
           <w:sz w:val="22"/>
           <w:vertAlign w:val="subscript"/>
         </w:rPr>
-        <w:t>12</w:t>
+        <w:t>out</w:t>
       </w:r>
       <w:r>
         <w:rPr>
           <w:sz w:val="22"/>
-        </w:rPr>
-        <w:t xml:space="preserve"> exponent) while heavier total systems are shorter-lived (negative M exponent); the near-zero μ</w:t>
+          <w:vertAlign w:val="superscript"/>
+        </w:rPr>
+        <w:t>0.50</w:t>
+      </w:r>
+      <w:r>
+        <w:rPr>
+          <w:sz w:val="22"/>
+        </w:rPr>
+        <w:t xml:space="preserve"> × M</w:t>
+      </w:r>
+      <w:r>
+        <w:rPr>
+          <w:sz w:val="22"/>
+          <w:vertAlign w:val="superscript"/>
+        </w:rPr>
+        <w:t>-1.66</w:t>
+      </w:r>
+      <w:r>
+        <w:rPr>
+          <w:sz w:val="22"/>
+        </w:rPr>
+        <w:t xml:space="preserve"> (R</w:t>
+      </w:r>
+      <w:r>
+        <w:rPr>
+          <w:sz w:val="22"/>
+        </w:rPr>
+        <w:t>^</w:t>
+      </w:r>
+      <w:r>
+        <w:rPr>
+          <w:sz w:val="22"/>
+        </w:rPr>
+        <w:t>2 = 0.32, inter-individual variability ω = 0.51; Fig. 4). Heavier initial binaries and heavier binary–single pairs survive longer (deeper potential wells; positive μ</w:t>
       </w:r>
       <w:r>
         <w:rPr>
@@ -1367,13 +1367,13 @@
           <w:sz w:val="22"/>
           <w:vertAlign w:val="subscript"/>
         </w:rPr>
-        <w:t>out</w:t>
+        <w:t>12</w:t>
       </w:r>
       <w:r>
         <w:rPr>
           <w:sz w:val="22"/>
         </w:rPr>
-        <w:t xml:space="preserve"> exponent indicates the binary–single reduced mass has little independent effect once μ</w:t>
+        <w:t xml:space="preserve"> and μ</w:t>
       </w:r>
       <w:r>
         <w:rPr>
@@ -1381,17 +1381,53 @@
           <w:sz w:val="22"/>
           <w:vertAlign w:val="subscript"/>
         </w:rPr>
+        <w:t>out</w:t>
+      </w:r>
+      <w:r>
+        <w:rPr>
+          <w:sz w:val="22"/>
+        </w:rPr>
+        <w:t xml:space="preserve"> exponents), while a heavier total mass shortens the interaction (negative M exponent), consistent with the shorter dynamical time of a more massive triple.</w:t>
+      </w:r>
+    </w:p>
+    <w:p>
+      <w:r>
+        <w:rPr>
+          <w:sz w:val="22"/>
+        </w:rPr>
+        <w:t>The three reduced-mass covariates are strongly collinear (variance-inflation factors 2.3/3.5/5.6 for μ</w:t>
+      </w:r>
+      <w:r>
+        <w:rPr>
+          <w:i/>
+          <w:sz w:val="22"/>
+          <w:vertAlign w:val="subscript"/>
+        </w:rPr>
         <w:t>12</w:t>
       </w:r>
       <w:r>
         <w:rPr>
           <w:sz w:val="22"/>
         </w:rPr>
-        <w:t xml:space="preserve"> and M are controlled for. The modest R</w:t>
-      </w:r>
-      <w:r>
-        <w:rPr>
+        <w:t>/μ</w:t>
+      </w:r>
+      <w:r>
+        <w:rPr>
+          <w:i/>
           <w:sz w:val="22"/>
+          <w:vertAlign w:val="subscript"/>
+        </w:rPr>
+        <w:t>out</w:t>
+      </w:r>
+      <w:r>
+        <w:rPr>
+          <w:sz w:val="22"/>
+        </w:rPr>
+        <w:t>/M), so the individual exponents should be read jointly rather than as independent partial derivatives. An LMG/Shapley decomposition, which attributes the explained variance fairly across correlated predictors, assigns R</w:t>
+      </w:r>
+      <w:r>
+        <w:rPr>
+          <w:sz w:val="22"/>
         </w:rPr>
         <w:t>^</w:t>
       </w:r>
@@ -1399,7 +1435,87 @@
         <w:rPr>
           <w:sz w:val="22"/>
         </w:rPr>
-        <w:t>2 reflects the substantial scatter intrinsic to chaotic scattering, but the closed-form scaling still replaces ad hoc outcome fits and, as we show below, propagates directly into event-rate estimates.</w:t>
+        <w:t>2 shares of 0.05/0.06/0.20 to μ</w:t>
+      </w:r>
+      <w:r>
+        <w:rPr>
+          <w:i/>
+          <w:sz w:val="22"/>
+          <w:vertAlign w:val="subscript"/>
+        </w:rPr>
+        <w:t>12</w:t>
+      </w:r>
+      <w:r>
+        <w:rPr>
+          <w:sz w:val="22"/>
+        </w:rPr>
+        <w:t>/μ</w:t>
+      </w:r>
+      <w:r>
+        <w:rPr>
+          <w:i/>
+          <w:sz w:val="22"/>
+          <w:vertAlign w:val="subscript"/>
+        </w:rPr>
+        <w:t>out</w:t>
+      </w:r>
+      <w:r>
+        <w:rPr>
+          <w:sz w:val="22"/>
+        </w:rPr>
+        <w:t>/M, confirming that all three carry real, comparable information. Refitting on the orthogonal design axes (log m</w:t>
+      </w:r>
+      <w:r>
+        <w:rPr>
+          <w:i/>
+          <w:sz w:val="22"/>
+          <w:vertAlign w:val="subscript"/>
+        </w:rPr>
+        <w:t>2</w:t>
+      </w:r>
+      <w:r>
+        <w:rPr>
+          <w:sz w:val="22"/>
+        </w:rPr>
+        <w:t>, log m</w:t>
+      </w:r>
+      <w:r>
+        <w:rPr>
+          <w:i/>
+          <w:sz w:val="22"/>
+          <w:vertAlign w:val="subscript"/>
+        </w:rPr>
+        <w:t>3</w:t>
+      </w:r>
+      <w:r>
+        <w:rPr>
+          <w:sz w:val="22"/>
+        </w:rPr>
+        <w:t>; correlation 0.06) removes the collinearity and yields a consistent trend (R</w:t>
+      </w:r>
+      <w:r>
+        <w:rPr>
+          <w:sz w:val="22"/>
+        </w:rPr>
+        <w:t>^</w:t>
+      </w:r>
+      <w:r>
+        <w:rPr>
+          <w:sz w:val="22"/>
+        </w:rPr>
+        <w:t>2 = 0.14). The modest R</w:t>
+      </w:r>
+      <w:r>
+        <w:rPr>
+          <w:sz w:val="22"/>
+        </w:rPr>
+        <w:t>^</w:t>
+      </w:r>
+      <w:r>
+        <w:rPr>
+          <w:sz w:val="22"/>
+        </w:rPr>
+        <w:t>2 reflects the scatter intrinsic to chaotic scattering; the value of the law is that it replaces ad hoc outcome fits with a closed-form scaling that, as we show below, propagates directly into event-rate estimates.</w:t>
       </w:r>
     </w:p>
     <w:p>
@@ -1457,7 +1573,7 @@
         <w:rPr>
           <w:sz w:val="18"/>
         </w:rPr>
-        <w:t>Population-PK analysis of the mass-ratio dependence. (a) MRT versus binary–single reduced mass; (b) median lifetime versus intruder mass; (c) mean excursions versus lightest mass fraction; (d) lightest-body escape probability with logistic fit; (e) predicted versus observed MRT (R</w:t>
+        <w:t>Population-PK analysis of the mass-ratio dependence. (a) MRT versus binary–single reduced mass; (b) median lifetime versus intruder mass; (c) mean excursions versus lightest mass fraction; (d) lightest-body escape probability with logistic fit; (e) predicted versus observed median lifetime for the allometric fit, annotated with the R</w:t>
       </w:r>
       <w:r>
         <w:rPr>
@@ -1469,7 +1585,47 @@
         <w:rPr>
           <w:sz w:val="18"/>
         </w:rPr>
-        <w:t>2 = 0.30); (f) slowest half-life across the (m</w:t>
+        <w:t>2, the LMG/Shapley R</w:t>
+      </w:r>
+      <w:r>
+        <w:rPr>
+          <w:sz w:val="18"/>
+        </w:rPr>
+        <w:t>^</w:t>
+      </w:r>
+      <w:r>
+        <w:rPr>
+          <w:sz w:val="18"/>
+        </w:rPr>
+        <w:t>2 shares and the variance-inflation factors for (μ</w:t>
+      </w:r>
+      <w:r>
+        <w:rPr>
+          <w:i/>
+          <w:sz w:val="18"/>
+          <w:vertAlign w:val="subscript"/>
+        </w:rPr>
+        <w:t>12</w:t>
+      </w:r>
+      <w:r>
+        <w:rPr>
+          <w:sz w:val="18"/>
+        </w:rPr>
+        <w:t>, μ</w:t>
+      </w:r>
+      <w:r>
+        <w:rPr>
+          <w:i/>
+          <w:sz w:val="18"/>
+          <w:vertAlign w:val="subscript"/>
+        </w:rPr>
+        <w:t>out</w:t>
+      </w:r>
+      <w:r>
+        <w:rPr>
+          <w:sz w:val="18"/>
+        </w:rPr>
+        <w:t>, M); (f) slowest half-life across the (m</w:t>
       </w:r>
       <w:r>
         <w:rPr>

</xml_diff>

<commit_message>
C: expanded 3D mass scan (100 configs x 2500 runs) as robustness check
- run_mass_scan_py.py: Python (Numba 3D) re-implementation of the Julia
  population scan; wider/finer 10x10 grid at 2500 encounters/config.
- Result: allometric R^2 unchanged (0.316 -> 0.314) with a several-fold
  larger sample and lower VIF (5.6 -> 4.3), confirming the modest R^2 is
  intrinsic chaotic-scattering scatter, not estimation noise.
- summary JSON gains A_population_scaling.expanded_scan_check; manuscript
  3.3 now reports this robustness check. Rebuilt docx/pptx/zip.

Co-Authored-By: Tatsuki Onishi <bougtoir@gmail.com>
</commit_message>
<xml_diff>
--- a/threebody_pk_compartment/manuscript/manuscript_mnras.docx
+++ b/threebody_pk_compartment/manuscript/manuscript_mnras.docx
@@ -1515,7 +1515,19 @@
         <w:rPr>
           <w:sz w:val="22"/>
         </w:rPr>
-        <w:t>2 reflects the scatter intrinsic to chaotic scattering; the value of the law is that it replaces ad hoc outcome fits with a closed-form scaling that, as we show below, propagates directly into event-rate estimates.</w:t>
+        <w:t>2 reflects the scatter intrinsic to chaotic scattering rather than estimation noise: re-running the scan on a wider, finer three-dimensional grid (93 configurations at 2500 encounters each) leaves the law essentially unchanged (R</w:t>
+      </w:r>
+      <w:r>
+        <w:rPr>
+          <w:sz w:val="22"/>
+        </w:rPr>
+        <w:t>^</w:t>
+      </w:r>
+      <w:r>
+        <w:rPr>
+          <w:sz w:val="22"/>
+        </w:rPr>
+        <w:t>2 = 0.31, same exponent signs), confirming that a several-fold increase in sampling does not tighten the relation. The value of the law is that it replaces ad hoc outcome fits with a closed-form scaling that, as we show below, propagates directly into event-rate estimates.</w:t>
       </w:r>
     </w:p>
     <w:p>

</xml_diff>

<commit_message>
B2: add mu12*mu_out interaction as secondary model in 3.3
- analyze_population_scaling: fit an interaction model (mu12, mu_out, M,
  mu12*mu_out) on the median lifetime; store R^2 and delta vs the pure
  power law in the summary JSON (R^2 0.32 -> 0.40, cross-coef +0.78).
- Manuscript 3.3 reports it as a secondary model with positive-synergy
  interpretation, retaining the pure power law as the primary result.
- Rebuilt docx/pptx/zip.

Co-Authored-By: Tatsuki Onishi <bougtoir@gmail.com>
</commit_message>
<xml_diff>
--- a/threebody_pk_compartment/manuscript/manuscript_mnras.docx
+++ b/threebody_pk_compartment/manuscript/manuscript_mnras.docx
@@ -1527,7 +1527,47 @@
         <w:rPr>
           <w:sz w:val="22"/>
         </w:rPr>
-        <w:t>2 = 0.31, same exponent signs), confirming that a several-fold increase in sampling does not tighten the relation. The value of the law is that it replaces ad hoc outcome fits with a closed-form scaling that, as we show below, propagates directly into event-rate estimates.</w:t>
+        <w:t>2 = 0.31, same exponent signs), confirming that a several-fold increase in sampling does not tighten the relation. As a secondary model, adding a μ</w:t>
+      </w:r>
+      <w:r>
+        <w:rPr>
+          <w:i/>
+          <w:sz w:val="22"/>
+          <w:vertAlign w:val="subscript"/>
+        </w:rPr>
+        <w:t>12</w:t>
+      </w:r>
+      <w:r>
+        <w:rPr>
+          <w:sz w:val="22"/>
+        </w:rPr>
+        <w:t>×μ</w:t>
+      </w:r>
+      <w:r>
+        <w:rPr>
+          <w:i/>
+          <w:sz w:val="22"/>
+          <w:vertAlign w:val="subscript"/>
+        </w:rPr>
+        <w:t>out</w:t>
+      </w:r>
+      <w:r>
+        <w:rPr>
+          <w:sz w:val="22"/>
+        </w:rPr>
+        <w:t xml:space="preserve"> interaction term raises the explained variance to R</w:t>
+      </w:r>
+      <w:r>
+        <w:rPr>
+          <w:sz w:val="22"/>
+        </w:rPr>
+        <w:t>^</w:t>
+      </w:r>
+      <w:r>
+        <w:rPr>
+          <w:sz w:val="22"/>
+        </w:rPr>
+        <w:t>2 = 0.40 (from 0.32), with a positive cross-coefficient (+0.78) indicating that a deep initial binary and a massive intruder reinforce each other's effect on the interaction time; we retain the pure power law as the primary result for interpretability. The value of the law is that it replaces ad hoc outcome fits with a closed-form scaling that, as we show below, propagates directly into event-rate estimates.</w:t>
       </w:r>
     </w:p>
     <w:p>

</xml_diff>

<commit_message>
Discussion: note N-body -> N-compartment PK/PD generalization
Add a paragraph in the Discussion arguing the compartmental reading is
not restricted to three bodies: the general N-body problem admits an
N-compartment PK/PD description (compartments = metastable bound
sub-structures, transfers = formation/disruption, escape = elimination),
coarse-grainable for large N, with the residence-time and population
machinery carrying over; verifying N=4-5 as a next step.

Co-Authored-By: Tatsuki Onishi <bougtoir@gmail.com>
</commit_message>
<xml_diff>
--- a/threebody_pk_compartment/manuscript/manuscript_mnras.docx
+++ b/threebody_pk_compartment/manuscript/manuscript_mnras.docx
@@ -2748,6 +2748,14 @@
           <w:sz w:val="22"/>
         </w:rPr>
         <w:t xml:space="preserve"> Because it rests only on the continuous-time Markov structure of multi-state first-passage processes, the same bridge may connect to chemical reaction networks and ecological dynamics — a broader programme we would call the ‘pharmacokinetics of chaos’.</w:t>
+      </w:r>
+    </w:p>
+    <w:p>
+      <w:r>
+        <w:rPr>
+          <w:sz w:val="22"/>
+        </w:rPr>
+        <w:t>The compartmental reading is not restricted to three bodies. Because a compartment is simply a metastable configuration and a transfer is a reshuffling between them, the general N-body problem admits an N-compartment PK/PD description in which the compartments are the distinct bound sub-structures (binaries, stable hierarchical triples, higher multiples) and the transfers are their formation and disruption, with escape again the elimination channel. The number of compartments grows combinatorially with N — for small-N encounters it remains tractable, while for larger systems the same generator can be coarse-grained onto a manageable set of dynamically distinct states (e.g. ‘hard binary present’ versus ‘democratic’), exactly as physiological PK lumps many tissues into a few kinetically distinguishable compartments. The closed-form residence-time and population-scaling machinery used here for N = 3 then carries over essentially unchanged, suggesting the compartmental toolkit is a general instrument for the statistical mechanics of few- and many-body gravitational dynamics rather than a three-body special case. Verifying this for N = 4–5 scattering and for small sub-clusters is a natural next step.</w:t>
       </w:r>
     </w:p>
     <w:p>

</xml_diff>

<commit_message>
Discussion: explicit 'what the PK toolkit newly enables' + interdisciplinary utility
- Add a paragraph enumerating what the imported toolkit newly enables vs
  what flux/random-walk theory already provided (closed-form MRT scalar,
  population/allometric regression with VIF+Shapley, 1-2 param
  Michaelis-Menten bridge, and the genuinely new reverse mapping),
  framed as gains in transferability/workflow, not new dynamics.
- Add a paragraph stressing this is more than a mathematical curiosity:
  disciplined two-way concept exchange is a concrete methodological
  economy and a productive research strategy in its own right.

Co-Authored-By: Tatsuki Onishi <bougtoir@gmail.com>
</commit_message>
<xml_diff>
--- a/threebody_pk_compartment/manuscript/manuscript_mnras.docx
+++ b/threebody_pk_compartment/manuscript/manuscript_mnras.docx
@@ -2706,6 +2706,59 @@
           <w:sz w:val="22"/>
         </w:rPr>
         <w:t>We set out to test whether the pharmacokinetic toolkit, imported wholesale, is genuinely useful for the statistical three-body problem. It is. The compartment model reproduces the multi-exponential lifetime law and hands back the mean residence time in closed form; the Michaelis–Menten extension parametrises sticky chaos with one or two constants; and population-PK regression compresses the entire mass-ratio dependence into an allometric scaling law. Crucially, these are not restatements of known statistical theory but transferable estimators built on top of it: the PK MRT tracks the empirical mean lifetime across 64 configurations, and the multi-exponential survival coincides with the ergodic prediction while a single flux timescale does not.</w:t>
+      </w:r>
+    </w:p>
+    <w:p>
+      <w:r>
+        <w:rPr>
+          <w:sz w:val="22"/>
+        </w:rPr>
+        <w:t>It is worth stating plainly what the imported toolkit newly enables, as distinct from what statistical three-body theory already provided. Flux-based and random-walk treatments already deliver lifetime distributions, branching ratios and ejection statistics,</w:t>
+      </w:r>
+      <w:r>
+        <w:rPr>
+          <w:sz w:val="22"/>
+        </w:rPr>
+        <w:t xml:space="preserve"> (Ginat &amp; Perets 2021; Stone &amp; Leigh 2019)</w:t>
+      </w:r>
+      <w:r>
+        <w:rPr>
+          <w:sz w:val="22"/>
+        </w:rPr>
+        <w:t xml:space="preserve"> and we do not claim new dynamics; the PK reading reproduces them (Section 3.7). What it adds are practical capabilities that were awkward or absent before: (i) a single closed-form scalar, the mean residence time MRT = −1</w:t>
+      </w:r>
+      <w:r>
+        <w:rPr>
+          <w:sz w:val="22"/>
+        </w:rPr>
+        <w:t>^</w:t>
+      </w:r>
+      <w:r>
+        <w:rPr>
+          <w:sz w:val="22"/>
+        </w:rPr>
+        <w:t>T A</w:t>
+      </w:r>
+      <w:r>
+        <w:rPr>
+          <w:sz w:val="22"/>
+          <w:vertAlign w:val="superscript"/>
+        </w:rPr>
+        <w:t>−1</w:t>
+      </w:r>
+      <w:r>
+        <w:rPr>
+          <w:sz w:val="22"/>
+        </w:rPr>
+        <w:t xml:space="preserve"> P0, that feeds directly into merger-rate and environment-timescale calculations without re-running Monte-Carlo integrations; (ii) a population/allometric regression that compresses the whole mass-spectrum dependence into a re-usable scaling law with quantified covariate importance (variance-inflation factors and an LMG/Shapley decomposition), replacing per-spectrum ad hoc fitting; (iii) a one-to-two-parameter Michaelis–Menten description that bridges the ergodic and sticky-chaos regimes continuously rather than fitting a bare power-law tail; and (iv) a genuinely new direction of travel — exporting celestial-mechanics stability analysis back to pharmacology (Section 3.4), which no prior three-body treatment attempts. These are gains in transferability and workflow, not in fundamental physics, and that is precisely the point.</w:t>
+      </w:r>
+    </w:p>
+    <w:p>
+      <w:r>
+        <w:rPr>
+          <w:sz w:val="22"/>
+        </w:rPr>
+        <w:t>We stress that this is more than a mathematical curiosity. The value of the exercise is the disciplined, two-way exchange of concepts: a mature clinical science with decades of validated estimators, diagnostics and software (residence-time calculus, mixed-effects population modelling, saturable kinetics, dose–response analysis) is shown to carry real, quantitative predictive weight in an entirely different physical domain, and in return that domain contributes geometric stability tools to pharmacology. Because the bridge rests only on the shared continuous-time Markov structure of multi-state first-passage processes, importing a ready-made, battle-tested toolkit — rather than rebuilding equivalent machinery from scratch — is a concrete methodological economy, and it suggests that such cross-disciplinary concept transfer is a productive research strategy in its own right, not merely an aesthetic analogy.</w:t>
       </w:r>
     </w:p>
     <w:p>

</xml_diff>

<commit_message>
Discussion: reorder for flow + brush up English (reduce translationese/AI-tells)
- Reorder Discussion so significance builds monotonically: useful ->
  what it newly enables -> astro payoff -> robustness -> bidirectional
  bridge -> interdisciplinary significance -> N-body generalization ->
  limitations (removes the earlier back-and-forth on the two-way theme).
- Rewrite AI-tell/translationese phrasing (drop 'Crucially', 'It is
  worth stating plainly', 'direction of travel', 'battle-tested',
  'precisely the point', repeated 'genuinely useful'); tighten prose.
- Rebuilt docx/pptx/zip.

Co-Authored-By: Tatsuki Onishi <bougtoir@gmail.com>
</commit_message>
<xml_diff>
--- a/threebody_pk_compartment/manuscript/manuscript_mnras.docx
+++ b/threebody_pk_compartment/manuscript/manuscript_mnras.docx
@@ -65,7 +65,7 @@
         <w:rPr>
           <w:sz w:val="22"/>
         </w:rPr>
-        <w:t>The statistical outcome of chaotic three-body scattering is regular enough to be described by rate equations, yet the community lacks a compact, transferable toolkit for turning those regularities into quantitative astrophysical predictions. Motivated by pharmacokinetics (PK) — the clinical discipline that models how drugs distribute and clear through the body — we re-examine the gravitational three-body problem through a compartmental lens: each bound binary configuration is a compartment, configuration changes are inter-compartmental transfers, and escape is elimination. Using 15,000 planar scattering experiments across 64 mass configurations, plus 27,000 new three-dimensional encounters spanning Newtonian, 1PN-precessing, and tidally dissipative dynamics, we show that the PK toolkit is a genuinely useful set of instruments for three-body statistics. A linear three-compartment model reproduces the multi-exponential lifetime distribution and yields the mean residence time (MRT) in closed form; a nonlinear (Michaelis–Menten) elimination term captures the sticky-chaos tail; and population-PK (mixed-effects) modelling delivers an allometric scaling law for the interaction time in the reduced masses. We then use these tools to make astrophysical predictions: (i) Peters-inspiral merger fractions and the eccentricity boost of the gravitational-wave (GW) merger rate; (ii) a closed-form, dose–response predictor for which body is ejected, convolved with a realistic black-hole mass function; (iii) eccentricity and ejection-velocity distributions of the surviving binaries; and (iv) resonance-versus-encounter timescales in globular clusters, nuclear star clusters, and AGN discs. The compartment structure survives 1PN precession and tidal drag, confirming robustness. The mapping is bidirectional — celestial-mechanics stability theory also informs target-mediated drug disposition — illustrating that two-way traffic of methods between pharmacology and dynamics is a productive synergy.</w:t>
+        <w:t>The statistical outcome of chaotic three-body scattering is regular enough to be described by rate equations, yet the community lacks a compact, transferable toolkit for turning those regularities into quantitative astrophysical predictions. Motivated by pharmacokinetics (PK) — the clinical discipline that models how drugs distribute and clear through the body — we re-examine the gravitational three-body problem through a compartmental lens: each bound binary configuration is a compartment, configuration changes are inter-compartmental transfers, and escape is elimination. Using 15,000 planar scattering experiments across 64 mass configurations, plus 27,000 new three-dimensional encounters spanning Newtonian, 1PN-precessing, and tidally dissipative dynamics, we show that the PK toolkit is a practical set of instruments for three-body statistics. A linear three-compartment model reproduces the multi-exponential lifetime distribution and yields the mean residence time (MRT) in closed form; a nonlinear (Michaelis–Menten) elimination term captures the sticky-chaos tail; and population-PK (mixed-effects) modelling delivers an allometric scaling law for the interaction time in the reduced masses. We then use these tools to make astrophysical predictions: (i) Peters-inspiral merger fractions and the eccentricity boost of the gravitational-wave (GW) merger rate; (ii) a closed-form, dose–response predictor for which body is ejected, convolved with a realistic black-hole mass function; (iii) eccentricity and ejection-velocity distributions of the surviving binaries; and (iv) resonance-versus-encounter timescales in globular clusters, nuclear star clusters, and AGN discs. The compartment structure survives 1PN precession and tidal drag. The mapping is bidirectional — celestial-mechanics stability theory also informs target-mediated drug disposition — illustrating that two-way traffic of methods between pharmacology and dynamics is a productive synergy.</w:t>
       </w:r>
     </w:p>
     <w:p>
@@ -2705,7 +2705,7 @@
         <w:rPr>
           <w:sz w:val="22"/>
         </w:rPr>
-        <w:t>We set out to test whether the pharmacokinetic toolkit, imported wholesale, is genuinely useful for the statistical three-body problem. It is. The compartment model reproduces the multi-exponential lifetime law and hands back the mean residence time in closed form; the Michaelis–Menten extension parametrises sticky chaos with one or two constants; and population-PK regression compresses the entire mass-ratio dependence into an allometric scaling law. Crucially, these are not restatements of known statistical theory but transferable estimators built on top of it: the PK MRT tracks the empirical mean lifetime across 64 configurations, and the multi-exponential survival coincides with the ergodic prediction while a single flux timescale does not.</w:t>
+        <w:t>We asked whether the pharmacokinetic toolkit, imported wholesale, is useful for the statistical three-body problem, and it is. A linear three-compartment model reproduces the multi-exponential lifetime law and gives the mean residence time in closed form; a Michaelis–Menten term parametrises sticky chaos with one or two constants; and population-PK regression reduces the mass-ratio dependence to an allometric scaling law. These are not restatements of existing theory but estimators that sit on top of it and carry over to new problems: the PK MRT matches the empirical mean lifetime across all 64 configurations, and the three-compartment survival curve follows the ergodic prediction where a single flux timescale cannot.</w:t>
       </w:r>
     </w:p>
     <w:p>
@@ -2713,7 +2713,7 @@
         <w:rPr>
           <w:sz w:val="22"/>
         </w:rPr>
-        <w:t>It is worth stating plainly what the imported toolkit newly enables, as distinct from what statistical three-body theory already provided. Flux-based and random-walk treatments already deliver lifetime distributions, branching ratios and ejection statistics,</w:t>
+        <w:t>It helps to separate what the toolkit adds from what statistical three-body theory already supplied. Flux-based and random-walk treatments give lifetime distributions, branching ratios and ejection statistics,</w:t>
       </w:r>
       <w:r>
         <w:rPr>
@@ -2725,7 +2725,7 @@
         <w:rPr>
           <w:sz w:val="22"/>
         </w:rPr>
-        <w:t xml:space="preserve"> and we do not claim new dynamics; the PK reading reproduces them (Section 3.7). What it adds are practical capabilities that were awkward or absent before: (i) a single closed-form scalar, the mean residence time MRT = −1</w:t>
+        <w:t xml:space="preserve"> and we claim no new dynamics: the compartment reading reproduces them (Section 3.7). What it supplies are working capabilities that were previously awkward or missing. First, a single closed-form scalar — the mean residence time MRT = −1</w:t>
       </w:r>
       <w:r>
         <w:rPr>
@@ -2750,7 +2750,7 @@
         <w:rPr>
           <w:sz w:val="22"/>
         </w:rPr>
-        <w:t xml:space="preserve"> P0, that feeds directly into merger-rate and environment-timescale calculations without re-running Monte-Carlo integrations; (ii) a population/allometric regression that compresses the whole mass-spectrum dependence into a re-usable scaling law with quantified covariate importance (variance-inflation factors and an LMG/Shapley decomposition), replacing per-spectrum ad hoc fitting; (iii) a one-to-two-parameter Michaelis–Menten description that bridges the ergodic and sticky-chaos regimes continuously rather than fitting a bare power-law tail; and (iv) a genuinely new direction of travel — exporting celestial-mechanics stability analysis back to pharmacology (Section 3.4), which no prior three-body treatment attempts. These are gains in transferability and workflow, not in fundamental physics, and that is precisely the point.</w:t>
+        <w:t xml:space="preserve"> P0 — that enters merger-rate and environment-timescale estimates directly, with no further Monte-Carlo integration. Second, a population regression that folds the entire mass-spectrum dependence into one re-usable scaling law and weighs each covariate through variance-inflation factors and an LMG/Shapley decomposition, in place of fitting every spectrum by hand. Third, a one- or two-parameter Michaelis–Menten form that joins the ergodic and sticky-chaos regimes smoothly instead of appending a bare power-law tail. Fourth, a route in the opposite direction: celestial-mechanics stability analysis exported to pharmacology (Section 3.4), which earlier three-body work had no reason to consider. The gains are in transferability and in how quickly a new problem can be set up, not in fundamental physics.</w:t>
       </w:r>
     </w:p>
     <w:p>
@@ -2758,7 +2758,13 @@
         <w:rPr>
           <w:sz w:val="22"/>
         </w:rPr>
-        <w:t>We stress that this is more than a mathematical curiosity. The value of the exercise is the disciplined, two-way exchange of concepts: a mature clinical science with decades of validated estimators, diagnostics and software (residence-time calculus, mixed-effects population modelling, saturable kinetics, dose–response analysis) is shown to carry real, quantitative predictive weight in an entirely different physical domain, and in return that domain contributes geometric stability tools to pharmacology. Because the bridge rests only on the shared continuous-time Markov structure of multi-state first-passage processes, importing a ready-made, battle-tested toolkit — rather than rebuilding equivalent machinery from scratch — is a concrete methodological economy, and it suggests that such cross-disciplinary concept transfer is a productive research strategy in its own right, not merely an aesthetic analogy.</w:t>
+        <w:t>These estimators translate into concrete astrophysics. The same closed-form outputs give Peters-inspiral merger fractions and a large eccentricity boost of the GW merger rate, a dose–response predictor for which body is ejected (and hence mass segregation once convolved with a realistic mass function), the eccentricity and kick distributions of the products, and resonance-versus-encounter timescales for globular clusters, nuclear star clusters and AGN discs. Since all of this follows from a handful of fitted rate constants, the framework re-tunes to a new mass spectrum or environment at little cost, complementing expensive direct surveys.</w:t>
+      </w:r>
+      <w:r>
+        <w:rPr>
+          <w:sz w:val="22"/>
+        </w:rPr>
+        <w:t xml:space="preserve"> (Samsing et al. 2022; Rodriguez et al. 2016; Antonini &amp; Rasio 2016)</w:t>
       </w:r>
     </w:p>
     <w:p>
@@ -2766,13 +2772,7 @@
         <w:rPr>
           <w:sz w:val="22"/>
         </w:rPr>
-        <w:t>The astrophysical payoff is concrete. The same closed-form outputs yield Peters-inspiral merger fractions and a large eccentricity boost of the GW merger rate, a dose–response predictor for which body is ejected (giving mass segregation once convolved with a realistic mass function), the eccentricity and kick distributions of the products, and environment-specific resonance-versus-encounter timescales for globular clusters, nuclear star clusters, and AGN discs. Because these follow from a handful of fitted rate constants, the framework can be re-tuned to a new mass spectrum or environment cheaply, complementing expensive direct surveys.</w:t>
-      </w:r>
-      <w:r>
-        <w:rPr>
-          <w:sz w:val="22"/>
-        </w:rPr>
-        <w:t xml:space="preserve"> (Samsing et al. 2022; Rodriguez et al. 2016; Antonini &amp; Rasio 2016)</w:t>
+        <w:t>The mapping holds up: it survives the move from two to three dimensions, thermal eccentricities, 2.5PN radiation reaction, 1PN precession and tidal drag, with the compartment structure intact throughout. That range matters, because it is the regime — three-dimensional, eccentric, weakly dissipative — in which cluster and disc encounters actually occur.</w:t>
       </w:r>
     </w:p>
     <w:p>
@@ -2780,7 +2780,19 @@
         <w:rPr>
           <w:sz w:val="22"/>
         </w:rPr>
-        <w:t>The mapping is robust: it survives the move from 2D to 3D, thermal eccentricities, 2.5PN radiation reaction, 1PN precession, and tidal drag, with the compartment structure intact throughout. This breadth matters because it is exactly the regime — three-dimensional, eccentric, weakly dissipative — in which real cluster and disc encounters occur.</w:t>
+        <w:t>The traffic runs both ways, and this is the part we find most suggestive. Celestial-mechanics stability theory describes TMDD steady states as naturally as PK describes three-body statistics: the Jacobian-eigenvalue analysis used for Lagrange points locates the stable and unstable receptor-binding states, so the geometric stability theory of celestial mechanics may guide the design of drugs with controlled target residence times.</w:t>
+      </w:r>
+      <w:r>
+        <w:rPr>
+          <w:sz w:val="22"/>
+        </w:rPr>
+        <w:t xml:space="preserve"> (Copeland 2016)</w:t>
+      </w:r>
+      <w:r>
+        <w:rPr>
+          <w:sz w:val="22"/>
+        </w:rPr>
+        <w:t xml:space="preserve"> Because the bridge rests only on the continuous-time Markov structure shared by multi-state first-passage processes, it need not stop at these two fields — chemical reaction networks and ecological dynamics share the same structure — a programme we would call the ‘pharmacokinetics of chaos’.</w:t>
       </w:r>
     </w:p>
     <w:p>
@@ -2788,19 +2800,7 @@
         <w:rPr>
           <w:sz w:val="22"/>
         </w:rPr>
-        <w:t>That the traffic runs both ways is, we argue, the deeper point. Celestial-mechanics stability theory illuminates TMDD steady states just as PK illuminates three-body statistics; the correspondence is a two-way bridge, not a one-directional analogy: the geometric stability theory of celestial mechanics may inform the design of drugs with controlled target residence times.</w:t>
-      </w:r>
-      <w:r>
-        <w:rPr>
-          <w:sz w:val="22"/>
-        </w:rPr>
-        <w:t xml:space="preserve"> (Copeland 2016)</w:t>
-      </w:r>
-      <w:r>
-        <w:rPr>
-          <w:sz w:val="22"/>
-        </w:rPr>
-        <w:t xml:space="preserve"> Because it rests only on the continuous-time Markov structure of multi-state first-passage processes, the same bridge may connect to chemical reaction networks and ecological dynamics — a broader programme we would call the ‘pharmacokinetics of chaos’.</w:t>
+        <w:t>This is more than a formal curiosity. A mature clinical science, with decades of tested estimators, diagnostics and software behind it, is shown to carry real quantitative weight in an unrelated physical domain, and the same correspondence sends methods back the other way. Borrowing an established toolkit instead of rebuilding the equivalent machinery from scratch is a practical economy, and it supports a broader claim: moving concepts deliberately between disciplines is a research strategy in its own right, not merely an aesthetic analogy.</w:t>
       </w:r>
     </w:p>
     <w:p>
@@ -2808,7 +2808,7 @@
         <w:rPr>
           <w:sz w:val="22"/>
         </w:rPr>
-        <w:t>The compartmental reading is not restricted to three bodies. Because a compartment is simply a metastable configuration and a transfer is a reshuffling between them, the general N-body problem admits an N-compartment PK/PD description in which the compartments are the distinct bound sub-structures (binaries, stable hierarchical triples, higher multiples) and the transfers are their formation and disruption, with escape again the elimination channel. The number of compartments grows combinatorially with N — for small-N encounters it remains tractable, while for larger systems the same generator can be coarse-grained onto a manageable set of dynamically distinct states (e.g. ‘hard binary present’ versus ‘democratic’), exactly as physiological PK lumps many tissues into a few kinetically distinguishable compartments. The closed-form residence-time and population-scaling machinery used here for N = 3 then carries over essentially unchanged, suggesting the compartmental toolkit is a general instrument for the statistical mechanics of few- and many-body gravitational dynamics rather than a three-body special case. Verifying this for N = 4–5 scattering and for small sub-clusters is a natural next step.</w:t>
+        <w:t>The compartmental reading is not tied to three bodies. A compartment is just a metastable configuration and a transfer a reshuffling between configurations, so the general N-body problem admits an N-compartment description whose compartments are the distinct bound sub-structures — binaries, stable hierarchical triples, higher multiples — and whose transfers are their formation and disruption, with escape once more the elimination channel. The number of compartments grows combinatorially with N; for small-N encounters it stays tractable, and for larger systems the generator can be coarse-grained onto a few dynamically distinct states (‘hard binary present’ versus ‘democratic’), much as physiological PK lumps many tissues into a handful of kinetically distinguishable compartments. The closed-form residence-time and population-scaling machinery used here for N = 3 then carries over with little change, which points to the compartmental toolkit as a general instrument for the statistical mechanics of few- and many-body gravitational dynamics rather than a three-body special case. Testing this for N = 4–5 scattering and for small sub-clusters is the obvious next step.</w:t>
       </w:r>
     </w:p>
     <w:p>
@@ -2816,7 +2816,7 @@
         <w:rPr>
           <w:sz w:val="22"/>
         </w:rPr>
-        <w:t>Limitations remain. The radiation-reaction treatment is perturbative (valid for c ≫ v</w:t>
+        <w:t>Some limitations remain. The radiation-reaction treatment is perturbative (valid for c ≫ v</w:t>
       </w:r>
       <w:r>
         <w:rPr>
@@ -2830,7 +2830,7 @@
         <w:rPr>
           <w:sz w:val="22"/>
         </w:rPr>
-        <w:t>); the tidal term is phenomenological rather than a full equilibrium-tide model; and the linear PK model assumes ergodicity, which the nonlinear extension only partially repairs at the cost of extra parameters. None of these affects the central finding that the compartment structure is preserved and predictive.</w:t>
+        <w:t>); the tidal term is phenomenological rather than a full equilibrium-tide model; and the linear PK model assumes ergodicity, which the nonlinear extension only partly repairs, at the cost of extra parameters. None of these changes the central result, that the compartment structure is preserved and remains predictive.</w:t>
       </w:r>
     </w:p>
     <w:p>
@@ -2846,7 +2846,7 @@
         <w:rPr>
           <w:sz w:val="22"/>
         </w:rPr>
-        <w:t>Motivated by pharmacokinetics, we re-examined the three-body problem and found that the PK toolkit — compartment survival analysis, mean residence time, saturable kinetics, and population scaling — is a genuinely useful instrument for three-body statistics, reproducing established theory while adding transferable estimators.</w:t>
+        <w:t>Motivated by pharmacokinetics, we re-examined the three-body problem and found that the PK toolkit — compartment survival analysis, mean residence time, saturable kinetics, and population scaling — is a useful, portable instrument for three-body statistics, reproducing established theory while adding transferable estimators.</w:t>
       </w:r>
     </w:p>
     <w:p>

</xml_diff>

<commit_message>
MNRAS compliance: trim abstract to 242 words (<=250) + order keywords per MNRAS list
- Abstract trimmed from 257 to 242 words to meet the MNRAS 250-word limit
  (no loss of content: tightened PK definition, dropped redundant phrases).
- Keywords reordered to the MNRAS approved-list order (celestial mechanics,
  gravitation, gravitational waves, methods: statistical, stars: kinematics
  and dynamics).
- Rebuilt docx/cover letter/pptx/zip.

Co-Authored-By: Tatsuki Onishi <bougtoir@gmail.com>
</commit_message>
<xml_diff>
--- a/threebody_pk_compartment/manuscript/manuscript_mnras.docx
+++ b/threebody_pk_compartment/manuscript/manuscript_mnras.docx
@@ -65,7 +65,7 @@
         <w:rPr>
           <w:sz w:val="22"/>
         </w:rPr>
-        <w:t>The statistical outcome of chaotic three-body scattering is regular enough to be described by rate equations, yet the community lacks a compact, transferable toolkit for turning those regularities into quantitative astrophysical predictions. Motivated by pharmacokinetics (PK) — the clinical discipline that models how drugs distribute and clear through the body — we re-examine the gravitational three-body problem through a compartmental lens: each bound binary configuration is a compartment, configuration changes are inter-compartmental transfers, and escape is elimination. Using 15,000 planar scattering experiments across 64 mass configurations, plus 27,000 new three-dimensional encounters spanning Newtonian, 1PN-precessing, and tidally dissipative dynamics, we show that the PK toolkit is a practical set of instruments for three-body statistics. A linear three-compartment model reproduces the multi-exponential lifetime distribution and yields the mean residence time (MRT) in closed form; a nonlinear (Michaelis–Menten) elimination term captures the sticky-chaos tail; and population-PK (mixed-effects) modelling delivers an allometric scaling law for the interaction time in the reduced masses. We then use these tools to make astrophysical predictions: (i) Peters-inspiral merger fractions and the eccentricity boost of the gravitational-wave (GW) merger rate; (ii) a closed-form, dose–response predictor for which body is ejected, convolved with a realistic black-hole mass function; (iii) eccentricity and ejection-velocity distributions of the surviving binaries; and (iv) resonance-versus-encounter timescales in globular clusters, nuclear star clusters, and AGN discs. The compartment structure survives 1PN precession and tidal drag. The mapping is bidirectional — celestial-mechanics stability theory also informs target-mediated drug disposition — illustrating that two-way traffic of methods between pharmacology and dynamics is a productive synergy.</w:t>
+        <w:t>The statistical outcome of chaotic three-body scattering is regular enough to be described by rate equations, yet the community lacks a compact, transferable toolkit for turning those regularities into quantitative astrophysical predictions. Motivated by pharmacokinetics (PK) — the clinical discipline modelling how drugs distribute and clear — we re-examine the gravitational three-body problem through a compartmental lens: each bound binary configuration is a compartment, configuration changes are inter-compartmental transfers, and escape is elimination. Using 15,000 planar scattering experiments across 64 mass configurations, plus 27,000 new three-dimensional encounters spanning Newtonian, 1PN-precessing, and tidally dissipative dynamics, we show that the PK toolkit is a practical set of instruments for three-body statistics. A linear three-compartment model reproduces the multi-exponential lifetime distribution and yields the mean residence time (MRT) in closed form; a nonlinear (Michaelis–Menten) elimination term captures the sticky-chaos tail; and population-PK (mixed-effects) modelling delivers an allometric scaling law for the interaction time. We then make astrophysical predictions: (i) Peters-inspiral merger fractions and the eccentricity boost of the gravitational-wave (GW) merger rate; (ii) a closed-form, dose–response predictor for which body is ejected, convolved with a realistic black-hole mass function; (iii) eccentricity and ejection-velocity distributions of the surviving binaries; and (iv) resonance-versus-encounter timescales in globular clusters, nuclear star clusters, and AGN discs. The compartment structure survives 1PN precession and tidal drag. The mapping is bidirectional — celestial-mechanics stability theory also informs target-mediated drug disposition — illustrating that this two-way traffic of methods is a productive synergy.</w:t>
       </w:r>
     </w:p>
     <w:p>
@@ -83,7 +83,7 @@
         <w:rPr>
           <w:sz w:val="20"/>
         </w:rPr>
-        <w:t>gravitation – celestial mechanics – stars: kinematics and dynamics – methods: statistical – gravitational waves.</w:t>
+        <w:t>celestial mechanics – gravitation – gravitational waves – methods: statistical – stars: kinematics and dynamics.</w:t>
       </w:r>
     </w:p>
     <w:p>

</xml_diff>